<commit_message>
Remove unverified 80% groundwater-baseflow figure
Could not trace to a primary source. It entered via a web-search snippet
from virginiaplaces.org (secondary educational site) and was cited in
pathway_2 as (Richardson 1994; A-NPDC 2022) without either source being
confirmed to contain it. Phrasing was also near-tautological - baseflow is
by definition the groundwater-derived component.

Replaced on the poster with a verified qualitative claim (EPA noted no
significant surface streams; Speiran 1996 documents coastal groundwater
discharge). Flagged in pathway_2 and the poster verification table with
instructions for restoring a defensible figure.
</commit_message>
<xml_diff>
--- a/poster/POSTER_CONTENT_AND_LAYOUT.docx
+++ b/poster/POSTER_CONTENT_AND_LAYOUT.docx
@@ -2173,13 +2173,29 @@
           <w:bCs/>
           <w:b/>
         </w:rPr>
-        <w:t xml:space="preserve">~80%</w:t>
-      </w:r>
-      <w:r>
-        <w:t xml:space="preserve"> </w:t>
-      </w:r>
-      <w:r>
-        <w:t xml:space="preserve">&gt; of baseflow in Accomack County’s ~30 tidal creeks arrives as</w:t>
+        <w:t xml:space="preserve">No rivers</w:t>
+      </w:r>
+      <w:r>
+        <w:t xml:space="preserve"> </w:t>
+      </w:r>
+      <w:r>
+        <w:t xml:space="preserve">&gt; The Shore has</w:t>
+      </w:r>
+      <w:r>
+        <w:t xml:space="preserve"> </w:t>
+      </w:r>
+      <w:r>
+        <w:rPr>
+          <w:bCs/>
+          <w:b/>
+        </w:rPr>
+        <w:t xml:space="preserve">no significant surface streams</w:t>
+      </w:r>
+      <w:r>
+        <w:t xml:space="preserve"> </w:t>
+      </w:r>
+      <w:r>
+        <w:t xml:space="preserve">— a fact EPA cited in the sole-source designation. Its tidal creeks are fed principally by</w:t>
       </w:r>
       <w:r>
         <w:t xml:space="preserve"> </w:t>
@@ -2192,7 +2208,10 @@
         <w:t xml:space="preserve">groundwater discharge</w:t>
       </w:r>
       <w:r>
-        <w:t xml:space="preserve">, not surface runoff</w:t>
+        <w:t xml:space="preserve"> </w:t>
+      </w:r>
+      <w:r>
+        <w:t xml:space="preserve">(Speiran 1996; Richardson 1994).</w:t>
       </w:r>
     </w:p>
     <w:p>
@@ -2210,12 +2229,80 @@
         <w:t xml:space="preserve"> </w:t>
       </w:r>
       <w:r>
-        <w:t xml:space="preserve">If these creeks were fed mainly by rain running over the land, septic effluent would have no route into them. Because they are groundwater-fed, subsurface disposal becomes a surface-water problem.</w:t>
-      </w:r>
-    </w:p>
-    <w:p>
-      <w:pPr>
-        <w:pStyle w:val="BodyText"/>
+        <w:t xml:space="preserve">If these creeks were fed mainly by rain running over the land, septic effluent would have no route into them. Because they are groundwater-fed, subsurface disposal becomes a surface-water problem — and agricultural runoff is</w:t>
+      </w:r>
+      <w:r>
+        <w:t xml:space="preserve"> </w:t>
+      </w:r>
+      <w:r>
+        <w:rPr>
+          <w:iCs/>
+          <w:i/>
+        </w:rPr>
+        <w:t xml:space="preserve">not</w:t>
+      </w:r>
+      <w:r>
+        <w:t xml:space="preserve"> </w:t>
+      </w:r>
+      <w:r>
+        <w:t xml:space="preserve">the only thing reaching the water.</w:t>
+      </w:r>
+    </w:p>
+    <w:p>
+      <w:pPr>
+        <w:pStyle w:val="BlockText"/>
+      </w:pPr>
+      <w:r>
+        <w:rPr>
+          <w:bCs/>
+          <w:b/>
+        </w:rPr>
+        <w:t xml:space="preserve">⚠ Changed in v3 — see §11.</w:t>
+      </w:r>
+      <w:r>
+        <w:t xml:space="preserve"> </w:t>
+      </w:r>
+      <w:r>
+        <w:t xml:space="preserve">An earlier draft used</w:t>
+      </w:r>
+      <w:r>
+        <w:t xml:space="preserve"> </w:t>
+      </w:r>
+      <w:r>
+        <w:t xml:space="preserve">“</w:t>
+      </w:r>
+      <w:r>
+        <w:t xml:space="preserve">~80% of baseflow in Accomack County’s ~30 tidal creeks arrives as groundwater discharge.</w:t>
+      </w:r>
+      <w:r>
+        <w:t xml:space="preserve">”</w:t>
+      </w:r>
+      <w:r>
+        <w:t xml:space="preserve"> </w:t>
+      </w:r>
+      <w:r>
+        <w:t xml:space="preserve">That figure could not be traced to a primary source and the phrasing was technically wrong (baseflow</w:t>
+      </w:r>
+      <w:r>
+        <w:t xml:space="preserve"> </w:t>
+      </w:r>
+      <w:r>
+        <w:rPr>
+          <w:iCs/>
+          <w:i/>
+        </w:rPr>
+        <w:t xml:space="preserve">is</w:t>
+      </w:r>
+      <w:r>
+        <w:t xml:space="preserve"> </w:t>
+      </w:r>
+      <w:r>
+        <w:t xml:space="preserve">the groundwater-derived component, so the statement was near-tautological). If you can verify a defensible figure before printing, this block can be restored as a number — it is a stronger visual than the qualitative version.</w:t>
+      </w:r>
+    </w:p>
+    <w:p>
+      <w:pPr>
+        <w:pStyle w:val="FirstParagraph"/>
       </w:pPr>
       <w:r>
         <w:rPr>
@@ -6024,7 +6111,7 @@
           <w:bCs/>
           <w:b/>
         </w:rPr>
-        <w:t xml:space="preserve">Project-internal — cite as project modeling, not peer review (marked † on poster):</w:t>
+        <w:t xml:space="preserve">⚠ REMOVED in v3 — could not be verified:</w:t>
       </w:r>
     </w:p>
     <w:tbl>
@@ -6062,7 +6149,7 @@
               <w:jc w:val="left"/>
             </w:pPr>
             <w:r>
-              <w:t xml:space="preserve">Note</w:t>
+              <w:t xml:space="preserve">Problem</w:t>
             </w:r>
           </w:p>
         </w:tc>
@@ -6076,19 +6163,234 @@
               <w:jc w:val="left"/>
             </w:pPr>
             <w:r>
-              <w:t xml:space="preserve">7,800 systems at risk by 2040</w:t>
-            </w:r>
-          </w:p>
-        </w:tc>
-        <w:tc>
-          <w:tcPr/>
-          <w:p>
-            <w:pPr>
-              <w:pStyle w:val="Compact"/>
-              <w:jc w:val="left"/>
-            </w:pPr>
-            <w:r>
-              <w:t xml:space="preserve">ESVA Climate Equity StoryMap (2025); Hesamfar et al. (in review)</w:t>
+              <w:t xml:space="preserve">“</w:t>
+            </w:r>
+            <w:r>
+              <w:t xml:space="preserve">~80% of baseflow in Accomack County’s ~30 tidal creeks arrives as groundwater discharge</w:t>
+            </w:r>
+            <w:r>
+              <w:t xml:space="preserve">”</w:t>
+            </w:r>
+          </w:p>
+        </w:tc>
+        <w:tc>
+          <w:tcPr/>
+          <w:p>
+            <w:pPr>
+              <w:pStyle w:val="Compact"/>
+              <w:jc w:val="left"/>
+            </w:pPr>
+            <w:r>
+              <w:rPr>
+                <w:bCs/>
+                <w:b/>
+              </w:rPr>
+              <w:t xml:space="preserve">Two issues.</w:t>
+            </w:r>
+            <w:r>
+              <w:t xml:space="preserve"> </w:t>
+            </w:r>
+            <w:r>
+              <w:t xml:space="preserve">(1)</w:t>
+            </w:r>
+            <w:r>
+              <w:t xml:space="preserve"> </w:t>
+            </w:r>
+            <w:r>
+              <w:rPr>
+                <w:iCs/>
+                <w:i/>
+              </w:rPr>
+              <w:t xml:space="preserve">Sourcing:</w:t>
+            </w:r>
+            <w:r>
+              <w:t xml:space="preserve"> </w:t>
+            </w:r>
+            <w:r>
+              <w:t xml:space="preserve">traces to a web-search snippet from virginiaplaces.org, a secondary educational site — not peer-reviewed or agency-primary. It was cited in</w:t>
+            </w:r>
+            <w:r>
+              <w:t xml:space="preserve"> </w:t>
+            </w:r>
+            <w:r>
+              <w:rPr>
+                <w:rStyle w:val="VerbatimChar"/>
+              </w:rPr>
+              <w:t xml:space="preserve">research/pathway_2_tidal_creeks_marshes.md</w:t>
+            </w:r>
+            <w:r>
+              <w:t xml:space="preserve"> </w:t>
+            </w:r>
+            <w:r>
+              <w:t xml:space="preserve">as</w:t>
+            </w:r>
+            <w:r>
+              <w:t xml:space="preserve"> </w:t>
+            </w:r>
+            <w:r>
+              <w:t xml:space="preserve">“</w:t>
+            </w:r>
+            <w:r>
+              <w:t xml:space="preserve">(Richardson 1994; A-NPDC 2022),</w:t>
+            </w:r>
+            <w:r>
+              <w:t xml:space="preserve">”</w:t>
+            </w:r>
+            <w:r>
+              <w:t xml:space="preserve"> </w:t>
+            </w:r>
+            <w:r>
+              <w:t xml:space="preserve">but</w:t>
+            </w:r>
+            <w:r>
+              <w:t xml:space="preserve"> </w:t>
+            </w:r>
+            <w:r>
+              <w:rPr>
+                <w:bCs/>
+                <w:b/>
+              </w:rPr>
+              <w:t xml:space="preserve">neither source was actually confirmed to contain the figure</w:t>
+            </w:r>
+            <w:r>
+              <w:t xml:space="preserve">; that citation was inferred, not verified. Attempts to check virginiaplaces.org, the A-NPDC groundwater factsheet, USGS WSP 2401, and a Sanford IAHS paper all returned HTTP 403. (2)</w:t>
+            </w:r>
+            <w:r>
+              <w:t xml:space="preserve"> </w:t>
+            </w:r>
+            <w:r>
+              <w:rPr>
+                <w:iCs/>
+                <w:i/>
+              </w:rPr>
+              <w:t xml:space="preserve">Phrasing:</w:t>
+            </w:r>
+            <w:r>
+              <w:t xml:space="preserve"> </w:t>
+            </w:r>
+            <w:r>
+              <w:t xml:space="preserve">“</w:t>
+            </w:r>
+            <w:r>
+              <w:t xml:space="preserve">80% of baseflow is groundwater-derived</w:t>
+            </w:r>
+            <w:r>
+              <w:t xml:space="preserve">”</w:t>
+            </w:r>
+            <w:r>
+              <w:t xml:space="preserve"> </w:t>
+            </w:r>
+            <w:r>
+              <w:t xml:space="preserve">is near-tautological — baseflow is by definition the groundwater component. The meaningful claim would be</w:t>
+            </w:r>
+            <w:r>
+              <w:t xml:space="preserve"> </w:t>
+            </w:r>
+            <w:r>
+              <w:t xml:space="preserve">“</w:t>
+            </w:r>
+            <w:r>
+              <w:t xml:space="preserve">groundwater supplies ~80% of</w:t>
+            </w:r>
+            <w:r>
+              <w:t xml:space="preserve"> </w:t>
+            </w:r>
+            <w:r>
+              <w:rPr>
+                <w:bCs/>
+                <w:b/>
+              </w:rPr>
+              <w:t xml:space="preserve">total streamflow</w:t>
+            </w:r>
+            <w:r>
+              <w:t xml:space="preserve">.</w:t>
+            </w:r>
+            <w:r>
+              <w:t xml:space="preserve">”</w:t>
+            </w:r>
+          </w:p>
+        </w:tc>
+      </w:tr>
+    </w:tbl>
+    <w:p>
+      <w:pPr>
+        <w:pStyle w:val="BodyText"/>
+      </w:pPr>
+      <w:r>
+        <w:rPr>
+          <w:bCs/>
+          <w:b/>
+        </w:rPr>
+        <w:t xml:space="preserve">To restore it:</w:t>
+      </w:r>
+      <w:r>
+        <w:t xml:space="preserve"> </w:t>
+      </w:r>
+      <w:r>
+        <w:t xml:space="preserve">the likely primary sources are USGS WSP 2401 (Richardson 1994), USGS WSP 2479 (Speiran 1996), or a USGS base-flow separation study for Delmarva. A hydrologist at USGS Virginia–West Virginia Water Science Center or at A-NPDC could confirm quickly. If verified, phrase it as a fraction of</w:t>
+      </w:r>
+      <w:r>
+        <w:t xml:space="preserve"> </w:t>
+      </w:r>
+      <w:r>
+        <w:rPr>
+          <w:iCs/>
+          <w:i/>
+        </w:rPr>
+        <w:t xml:space="preserve">total streamflow</w:t>
+      </w:r>
+      <w:r>
+        <w:t xml:space="preserve">, not of baseflow.</w:t>
+      </w:r>
+    </w:p>
+    <w:p>
+      <w:pPr>
+        <w:pStyle w:val="BodyText"/>
+      </w:pPr>
+      <w:r>
+        <w:rPr>
+          <w:bCs/>
+          <w:b/>
+        </w:rPr>
+        <w:t xml:space="preserve">Project-internal — cite as project modeling, not peer review (marked † on poster):</w:t>
+      </w:r>
+    </w:p>
+    <w:tbl>
+      <w:tblPr>
+        <w:tblStyle w:val="Table"/>
+        <w:tblW w:type="pct" w:w="5000"/>
+        <w:tblLook w:firstRow="1" w:lastRow="0" w:firstColumn="0" w:lastColumn="0" w:noHBand="0" w:noVBand="0" w:val="0020"/>
+        <w:jc w:val="start"/>
+      </w:tblPr>
+      <w:tblGrid>
+        <w:gridCol w:w="3960"/>
+        <w:gridCol w:w="3960"/>
+      </w:tblGrid>
+      <w:tr>
+        <w:trPr>
+          <w:tblHeader w:val="true"/>
+        </w:trPr>
+        <w:tc>
+          <w:tcPr/>
+          <w:p>
+            <w:pPr>
+              <w:pStyle w:val="Compact"/>
+              <w:jc w:val="left"/>
+            </w:pPr>
+            <w:r>
+              <w:t xml:space="preserve">Claim</w:t>
+            </w:r>
+          </w:p>
+        </w:tc>
+        <w:tc>
+          <w:tcPr/>
+          <w:p>
+            <w:pPr>
+              <w:pStyle w:val="Compact"/>
+              <w:jc w:val="left"/>
+            </w:pPr>
+            <w:r>
+              <w:t xml:space="preserve">Note</w:t>
             </w:r>
           </w:p>
         </w:tc>
@@ -6102,19 +6404,19 @@
               <w:jc w:val="left"/>
             </w:pPr>
             <w:r>
-              <w:t xml:space="preserve">$156M replacement cost</w:t>
-            </w:r>
-          </w:p>
-        </w:tc>
-        <w:tc>
-          <w:tcPr/>
-          <w:p>
-            <w:pPr>
-              <w:pStyle w:val="Compact"/>
-              <w:jc w:val="left"/>
-            </w:pPr>
-            <w:r>
-              <w:t xml:space="preserve">Same source; derived from ~$20K/system</w:t>
+              <w:t xml:space="preserve">7,800 systems at risk by 2040</w:t>
+            </w:r>
+          </w:p>
+        </w:tc>
+        <w:tc>
+          <w:tcPr/>
+          <w:p>
+            <w:pPr>
+              <w:pStyle w:val="Compact"/>
+              <w:jc w:val="left"/>
+            </w:pPr>
+            <w:r>
+              <w:t xml:space="preserve">ESVA Climate Equity StoryMap (2025); Hesamfar et al. (in review)</w:t>
             </w:r>
           </w:p>
         </w:tc>
@@ -6128,19 +6430,19 @@
               <w:jc w:val="left"/>
             </w:pPr>
             <w:r>
-              <w:t xml:space="preserve">~80% of Accomack creek baseflow is groundwater</w:t>
-            </w:r>
-          </w:p>
-        </w:tc>
-        <w:tc>
-          <w:tcPr/>
-          <w:p>
-            <w:pPr>
-              <w:pStyle w:val="Compact"/>
-              <w:jc w:val="left"/>
-            </w:pPr>
-            <w:r>
-              <w:t xml:space="preserve">A-NPDC groundwater factsheet (2022) + Richardson 1994 USGS WSP 2401</w:t>
+              <w:t xml:space="preserve">$156M replacement cost</w:t>
+            </w:r>
+          </w:p>
+        </w:tc>
+        <w:tc>
+          <w:tcPr/>
+          <w:p>
+            <w:pPr>
+              <w:pStyle w:val="Compact"/>
+              <w:jc w:val="left"/>
+            </w:pPr>
+            <w:r>
+              <w:t xml:space="preserve">Same source; derived from ~$20K/system</w:t>
             </w:r>
           </w:p>
         </w:tc>

</xml_diff>

<commit_message>
Correct phosphorus framing: use-driven, not failure-driven
'AGE-DRIVEN' answered a different question than the column header asked, and
'as soils age' wrongly implied a process independent of septic systems. P is
now labelled NO - use-driven, with the description clarifying that it is the
individual system's own binding capacity being exhausted over decades.

Adds the one genuine failure link: reductive dissolution of Fe-oxides under a
risen water table can remobilise legacy P (Smith et al. 2021; scope caveat
noted - demonstrated in agricultural soils, and nitrate may buffer it).

Verified P transport behaviour against Robertson et al. 1999/2008.
</commit_message>
<xml_diff>
--- a/poster/POSTER_CONTENT_AND_LAYOUT.docx
+++ b/poster/POSTER_CONTENT_AND_LAYOUT.docx
@@ -2546,19 +2546,23 @@
               <w:jc w:val="left"/>
             </w:pPr>
             <w:r>
-              <w:t xml:space="preserve">Binds to soil until binding sites saturate, then</w:t>
-            </w:r>
-            <w:r>
-              <w:t xml:space="preserve"> </w:t>
-            </w:r>
-            <w:r>
-              <w:t xml:space="preserve">“</w:t>
-            </w:r>
-            <w:r>
-              <w:t xml:space="preserve">breaks through</w:t>
-            </w:r>
-            <w:r>
-              <w:t xml:space="preserve">”</w:t>
+              <w:t xml:space="preserve">Held by the soil until</w:t>
+            </w:r>
+            <w:r>
+              <w:t xml:space="preserve"> </w:t>
+            </w:r>
+            <w:r>
+              <w:rPr>
+                <w:iCs/>
+                <w:i/>
+              </w:rPr>
+              <w:t xml:space="preserve">that system’s own</w:t>
+            </w:r>
+            <w:r>
+              <w:t xml:space="preserve"> </w:t>
+            </w:r>
+            <w:r>
+              <w:t xml:space="preserve">binding capacity is used up after years to decades of operation — then breaks through</w:t>
             </w:r>
           </w:p>
         </w:tc>
@@ -2574,13 +2578,29 @@
                 <w:bCs/>
                 <w:b/>
               </w:rPr>
-              <w:t xml:space="preserve">AGE-DRIVEN</w:t>
-            </w:r>
-            <w:r>
-              <w:t xml:space="preserve"> </w:t>
-            </w:r>
-            <w:r>
-              <w:t xml:space="preserve">(amber)</w:t>
+              <w:t xml:space="preserve">NO</w:t>
+            </w:r>
+            <w:r>
+              <w:t xml:space="preserve"> </w:t>
+            </w:r>
+            <w:r>
+              <w:t xml:space="preserve">—</w:t>
+            </w:r>
+            <w:r>
+              <w:t xml:space="preserve"> </w:t>
+            </w:r>
+            <w:r>
+              <w:rPr>
+                <w:iCs/>
+                <w:i/>
+              </w:rPr>
+              <w:t xml:space="preserve">use-driven</w:t>
+            </w:r>
+            <w:r>
+              <w:t xml:space="preserve"> </w:t>
+            </w:r>
+            <w:r>
+              <w:t xml:space="preserve">(gray)</w:t>
             </w:r>
           </w:p>
         </w:tc>
@@ -2638,6 +2658,37 @@
         </w:tc>
       </w:tr>
     </w:tbl>
+    <w:p>
+      <w:pPr>
+        <w:pStyle w:val="BodyText"/>
+      </w:pPr>
+      <w:r>
+        <w:rPr>
+          <w:bCs/>
+          <w:b/>
+        </w:rPr>
+        <w:t xml:space="preserve">Caption under the table:</w:t>
+      </w:r>
+      <w:r>
+        <w:t xml:space="preserve"> </w:t>
+      </w:r>
+      <w:r>
+        <w:t xml:space="preserve">Phosphorus is the exception that proves the rule: it is limited by</w:t>
+      </w:r>
+      <w:r>
+        <w:t xml:space="preserve"> </w:t>
+      </w:r>
+      <w:r>
+        <w:rPr>
+          <w:iCs/>
+          <w:i/>
+        </w:rPr>
+        <w:t xml:space="preserve">cumulative use</w:t>
+      </w:r>
+      <w:r>
+        <w:t xml:space="preserve">, not by condition. One failure link does exist — when a rising water table saturates the soil, iron oxides dissolve and can release phosphorus they had been holding for years.</w:t>
+      </w:r>
+    </w:p>
     <w:p>
       <w:pPr>
         <w:pStyle w:val="BodyText"/>
@@ -2862,7 +2913,7 @@
               <w:jc w:val="left"/>
             </w:pPr>
             <w:r>
-              <w:t xml:space="preserve">Nitrate reaches the shallow aquifer largely untreated; phosphorus breaks through as soils age</w:t>
+              <w:t xml:space="preserve">Nitrate reaches the shallow aquifer largely untreated; phosphorus breaks through once a drainfield’s soil binding capacity is used up</w:t>
             </w:r>
           </w:p>
         </w:tc>
@@ -6056,6 +6107,156 @@
               <w:jc w:val="left"/>
             </w:pPr>
             <w:r>
+              <w:t xml:space="preserve">Phosphorus is retarded by soil sorption until that system’s finite binding capacity is exhausted, then breaks through; plumes advance ~1 m/yr (retardation ≈20×) and can extend 70+ m from long-used systems in sandy soil; loading persists for years after decommissioning</w:t>
+            </w:r>
+          </w:p>
+        </w:tc>
+        <w:tc>
+          <w:tcPr/>
+          <w:p>
+            <w:pPr>
+              <w:pStyle w:val="Compact"/>
+              <w:jc w:val="left"/>
+            </w:pPr>
+            <w:r>
+              <w:t xml:space="preserve">✅ Verified</w:t>
+            </w:r>
+          </w:p>
+        </w:tc>
+        <w:tc>
+          <w:tcPr/>
+          <w:p>
+            <w:pPr>
+              <w:pStyle w:val="Compact"/>
+              <w:jc w:val="left"/>
+            </w:pPr>
+            <w:r>
+              <w:t xml:space="preserve">Robertson et al.,</w:t>
+            </w:r>
+            <w:r>
+              <w:t xml:space="preserve"> </w:t>
+            </w:r>
+            <w:r>
+              <w:rPr>
+                <w:iCs/>
+                <w:i/>
+              </w:rPr>
+              <w:t xml:space="preserve">Groundwater</w:t>
+            </w:r>
+            <w:r>
+              <w:t xml:space="preserve"> </w:t>
+            </w:r>
+            <w:r>
+              <w:t xml:space="preserve">(1999, 2008); review of P attenuation across 24 septic plumes,</w:t>
+            </w:r>
+            <w:r>
+              <w:t xml:space="preserve"> </w:t>
+            </w:r>
+            <w:r>
+              <w:rPr>
+                <w:iCs/>
+                <w:i/>
+              </w:rPr>
+              <w:t xml:space="preserve">Sci. Total Environ.</w:t>
+            </w:r>
+            <w:r>
+              <w:t xml:space="preserve"> </w:t>
+            </w:r>
+            <w:r>
+              <w:t xml:space="preserve">(2020)</w:t>
+            </w:r>
+          </w:p>
+        </w:tc>
+      </w:tr>
+      <w:tr>
+        <w:tc>
+          <w:tcPr/>
+          <w:p>
+            <w:pPr>
+              <w:pStyle w:val="Compact"/>
+              <w:jc w:val="left"/>
+            </w:pPr>
+            <w:r>
+              <w:t xml:space="preserve">Saturation/anoxia causes reductive dissolution of Fe-oxides, releasing bound phosphorus</w:t>
+            </w:r>
+          </w:p>
+        </w:tc>
+        <w:tc>
+          <w:tcPr/>
+          <w:p>
+            <w:pPr>
+              <w:pStyle w:val="Compact"/>
+              <w:jc w:val="left"/>
+            </w:pPr>
+            <w:r>
+              <w:t xml:space="preserve">✅ Mechanism verified —</w:t>
+            </w:r>
+            <w:r>
+              <w:t xml:space="preserve"> </w:t>
+            </w:r>
+            <w:r>
+              <w:rPr>
+                <w:bCs/>
+                <w:b/>
+              </w:rPr>
+              <w:t xml:space="preserve">note scope</w:t>
+            </w:r>
+          </w:p>
+        </w:tc>
+        <w:tc>
+          <w:tcPr/>
+          <w:p>
+            <w:pPr>
+              <w:pStyle w:val="Compact"/>
+              <w:jc w:val="left"/>
+            </w:pPr>
+            <w:r>
+              <w:t xml:space="preserve">Smith et al. 2021,</w:t>
+            </w:r>
+            <w:r>
+              <w:t xml:space="preserve"> </w:t>
+            </w:r>
+            <w:r>
+              <w:rPr>
+                <w:iCs/>
+                <w:i/>
+              </w:rPr>
+              <w:t xml:space="preserve">J. Environ. Qual.</w:t>
+            </w:r>
+            <w:r>
+              <w:t xml:space="preserve"> </w:t>
+            </w:r>
+            <w:r>
+              <w:t xml:space="preserve">50:1207. Demonstrated in</w:t>
+            </w:r>
+            <w:r>
+              <w:t xml:space="preserve"> </w:t>
+            </w:r>
+            <w:r>
+              <w:rPr>
+                <w:bCs/>
+                <w:b/>
+              </w:rPr>
+              <w:t xml:space="preserve">agricultural</w:t>
+            </w:r>
+            <w:r>
+              <w:t xml:space="preserve"> </w:t>
+            </w:r>
+            <w:r>
+              <w:t xml:space="preserve">soil profiles; extension to septic drainfields under rising water tables is a well-founded inference, not a directly cited septic study. Nitrate is a preferred electron acceptor over Fe, so nitrate-rich septic plumes may buffer the reaction.</w:t>
+            </w:r>
+          </w:p>
+        </w:tc>
+      </w:tr>
+      <w:tr>
+        <w:tc>
+          <w:tcPr/>
+          <w:p>
+            <w:pPr>
+              <w:pStyle w:val="Compact"/>
+              <w:jc w:val="left"/>
+            </w:pPr>
+            <w:r>
               <w:t xml:space="preserve">~7% → ~37% fecal indicator exceedance dry vs. post-rain</w:t>
             </w:r>
           </w:p>
@@ -7371,6 +7572,167 @@
             </w:r>
             <w:r>
               <w:t xml:space="preserve">.</w:t>
+            </w:r>
+          </w:p>
+        </w:tc>
+      </w:tr>
+      <w:tr>
+        <w:tc>
+          <w:tcPr/>
+          <w:p>
+            <w:pPr>
+              <w:pStyle w:val="Compact"/>
+              <w:jc w:val="left"/>
+            </w:pPr>
+            <w:r>
+              <w:t xml:space="preserve">10a</w:t>
+            </w:r>
+          </w:p>
+        </w:tc>
+        <w:tc>
+          <w:tcPr/>
+          <w:p>
+            <w:pPr>
+              <w:pStyle w:val="Compact"/>
+              <w:jc w:val="left"/>
+            </w:pPr>
+            <w:r>
+              <w:t xml:space="preserve">Phosphorus was labelled</w:t>
+            </w:r>
+            <w:r>
+              <w:t xml:space="preserve"> </w:t>
+            </w:r>
+            <w:r>
+              <w:rPr>
+                <w:bCs/>
+                <w:b/>
+              </w:rPr>
+              <w:t xml:space="preserve">AGE-DRIVEN</w:t>
+            </w:r>
+            <w:r>
+              <w:t xml:space="preserve"> </w:t>
+            </w:r>
+            <w:r>
+              <w:t xml:space="preserve">in a column headed</w:t>
+            </w:r>
+            <w:r>
+              <w:t xml:space="preserve"> </w:t>
+            </w:r>
+            <w:r>
+              <w:t xml:space="preserve">“</w:t>
+            </w:r>
+            <w:r>
+              <w:t xml:space="preserve">Failure-driven?</w:t>
+            </w:r>
+            <w:r>
+              <w:t xml:space="preserve">”</w:t>
+            </w:r>
+            <w:r>
+              <w:t xml:space="preserve">, and Column 3 said P</w:t>
+            </w:r>
+            <w:r>
+              <w:t xml:space="preserve"> </w:t>
+            </w:r>
+            <w:r>
+              <w:t xml:space="preserve">“</w:t>
+            </w:r>
+            <w:r>
+              <w:t xml:space="preserve">breaks through as soils age</w:t>
+            </w:r>
+            <w:r>
+              <w:t xml:space="preserve">”</w:t>
+            </w:r>
+          </w:p>
+        </w:tc>
+        <w:tc>
+          <w:tcPr/>
+          <w:p>
+            <w:pPr>
+              <w:pStyle w:val="Compact"/>
+              <w:jc w:val="left"/>
+            </w:pPr>
+            <w:r>
+              <w:rPr>
+                <w:bCs/>
+                <w:b/>
+              </w:rPr>
+              <w:t xml:space="preserve">Corrected (v3).</w:t>
+            </w:r>
+            <w:r>
+              <w:t xml:space="preserve"> </w:t>
+            </w:r>
+            <w:r>
+              <w:t xml:space="preserve">“</w:t>
+            </w:r>
+            <w:r>
+              <w:t xml:space="preserve">Age</w:t>
+            </w:r>
+            <w:r>
+              <w:t xml:space="preserve">”</w:t>
+            </w:r>
+            <w:r>
+              <w:t xml:space="preserve"> </w:t>
+            </w:r>
+            <w:r>
+              <w:t xml:space="preserve">meant the</w:t>
+            </w:r>
+            <w:r>
+              <w:t xml:space="preserve"> </w:t>
+            </w:r>
+            <w:r>
+              <w:rPr>
+                <w:iCs/>
+                <w:i/>
+              </w:rPr>
+              <w:t xml:space="preserve">septic system’s</w:t>
+            </w:r>
+            <w:r>
+              <w:t xml:space="preserve"> </w:t>
+            </w:r>
+            <w:r>
+              <w:t xml:space="preserve">cumulative operating time, not the geological age of the soil — the original wording implied a process unrelated to septic systems. P is now labelled</w:t>
+            </w:r>
+            <w:r>
+              <w:t xml:space="preserve"> </w:t>
+            </w:r>
+            <w:r>
+              <w:rPr>
+                <w:bCs/>
+                <w:b/>
+              </w:rPr>
+              <w:t xml:space="preserve">NO — use-driven</w:t>
+            </w:r>
+            <w:r>
+              <w:t xml:space="preserve">, with the description clarifying it is</w:t>
+            </w:r>
+            <w:r>
+              <w:t xml:space="preserve"> </w:t>
+            </w:r>
+            <w:r>
+              <w:rPr>
+                <w:iCs/>
+                <w:i/>
+              </w:rPr>
+              <w:t xml:space="preserve">that system’s own</w:t>
+            </w:r>
+            <w:r>
+              <w:t xml:space="preserve"> </w:t>
+            </w:r>
+            <w:r>
+              <w:t xml:space="preserve">binding capacity being exhausted. A note records the one genuine failure link: reductive dissolution of iron oxides under a risen water table can remobilise legacy phosphorus (Smith et al. 2021,</w:t>
+            </w:r>
+            <w:r>
+              <w:t xml:space="preserve"> </w:t>
+            </w:r>
+            <w:r>
+              <w:rPr>
+                <w:iCs/>
+                <w:i/>
+              </w:rPr>
+              <w:t xml:space="preserve">J. Environ. Qual.</w:t>
+            </w:r>
+            <w:r>
+              <w:t xml:space="preserve">, mechanism established in soils generally; nitrate-rich septic plumes may delay it, since nitrate is the preferred electron acceptor).</w:t>
             </w:r>
           </w:p>
         </w:tc>

</xml_diff>

<commit_message>
Restore 80% groundwater figure with primary source
Alex Foxworthy located the origin: Accomack County Regional Water Supply Plan
(April 2010) - 'There are a total of thirty tidal creeks in Accomack County,
which are largely supplied from groundwater discharge (approximately 80%).'

Restored with three corrections vs. the original draft:
- attributed to its actual source, not to Richardson 1994 / A-NPDC 2022
  (which were never checked and are not its origin)
- described as a share of creek supply/flow, not of 'baseflow'
- explicit Accomack-only scope note; not Shore-wide
</commit_message>
<xml_diff>
--- a/poster/POSTER_CONTENT_AND_LAYOUT.docx
+++ b/poster/POSTER_CONTENT_AND_LAYOUT.docx
@@ -2173,29 +2173,29 @@
           <w:bCs/>
           <w:b/>
         </w:rPr>
-        <w:t xml:space="preserve">No rivers</w:t>
-      </w:r>
-      <w:r>
-        <w:t xml:space="preserve"> </w:t>
-      </w:r>
-      <w:r>
-        <w:t xml:space="preserve">&gt; The Shore has</w:t>
-      </w:r>
-      <w:r>
-        <w:t xml:space="preserve"> </w:t>
-      </w:r>
-      <w:r>
-        <w:rPr>
-          <w:bCs/>
-          <w:b/>
-        </w:rPr>
-        <w:t xml:space="preserve">no significant surface streams</w:t>
-      </w:r>
-      <w:r>
-        <w:t xml:space="preserve"> </w:t>
-      </w:r>
-      <w:r>
-        <w:t xml:space="preserve">— a fact EPA cited in the sole-source designation. Its tidal creeks are fed principally by</w:t>
+        <w:t xml:space="preserve">~80%</w:t>
+      </w:r>
+      <w:r>
+        <w:t xml:space="preserve"> </w:t>
+      </w:r>
+      <w:r>
+        <w:t xml:space="preserve">&gt; of the water supplying</w:t>
+      </w:r>
+      <w:r>
+        <w:t xml:space="preserve"> </w:t>
+      </w:r>
+      <w:r>
+        <w:rPr>
+          <w:bCs/>
+          <w:b/>
+        </w:rPr>
+        <w:t xml:space="preserve">Accomack County’s 30 tidal creeks</w:t>
+      </w:r>
+      <w:r>
+        <w:t xml:space="preserve"> </w:t>
+      </w:r>
+      <w:r>
+        <w:t xml:space="preserve">comes from</w:t>
       </w:r>
       <w:r>
         <w:t xml:space="preserve"> </w:t>
@@ -2211,7 +2211,7 @@
         <w:t xml:space="preserve"> </w:t>
       </w:r>
       <w:r>
-        <w:t xml:space="preserve">(Speiran 1996; Richardson 1994).</w:t>
+        <w:t xml:space="preserve">(Accomack County Regional Water Supply Plan, 2010). Shore-wide there are no significant surface streams — a fact EPA cited in the sole-source designation.</w:t>
       </w:r>
     </w:p>
     <w:p>
@@ -2257,31 +2257,13 @@
           <w:bCs/>
           <w:b/>
         </w:rPr>
-        <w:t xml:space="preserve">⚠ Changed in v3 — see §11.</w:t>
-      </w:r>
-      <w:r>
-        <w:t xml:space="preserve"> </w:t>
-      </w:r>
-      <w:r>
-        <w:t xml:space="preserve">An earlier draft used</w:t>
-      </w:r>
-      <w:r>
-        <w:t xml:space="preserve"> </w:t>
-      </w:r>
-      <w:r>
-        <w:t xml:space="preserve">“</w:t>
-      </w:r>
-      <w:r>
-        <w:t xml:space="preserve">~80% of baseflow in Accomack County’s ~30 tidal creeks arrives as groundwater discharge.</w:t>
-      </w:r>
-      <w:r>
-        <w:t xml:space="preserve">”</w:t>
-      </w:r>
-      <w:r>
-        <w:t xml:space="preserve"> </w:t>
-      </w:r>
-      <w:r>
-        <w:t xml:space="preserve">That figure could not be traced to a primary source and the phrasing was technically wrong (baseflow</w:t>
+        <w:t xml:space="preserve">✅ Source resolved in v4 — see §11.</w:t>
+      </w:r>
+      <w:r>
+        <w:t xml:space="preserve"> </w:t>
+      </w:r>
+      <w:r>
+        <w:t xml:space="preserve">The 80% figure traces to the</w:t>
       </w:r>
       <w:r>
         <w:t xml:space="preserve"> </w:t>
@@ -2291,13 +2273,91 @@
           <w:iCs/>
           <w:i/>
         </w:rPr>
-        <w:t xml:space="preserve">is</w:t>
-      </w:r>
-      <w:r>
-        <w:t xml:space="preserve"> </w:t>
-      </w:r>
-      <w:r>
-        <w:t xml:space="preserve">the groundwater-derived component, so the statement was near-tautological). If you can verify a defensible figure before printing, this block can be restored as a number — it is a stronger visual than the qualitative version.</w:t>
+        <w:t xml:space="preserve">Accomack County Regional Water Supply Plan</w:t>
+      </w:r>
+      <w:r>
+        <w:t xml:space="preserve"> </w:t>
+      </w:r>
+      <w:r>
+        <w:t xml:space="preserve">(April 2010):</w:t>
+      </w:r>
+      <w:r>
+        <w:t xml:space="preserve"> </w:t>
+      </w:r>
+      <w:r>
+        <w:rPr>
+          <w:iCs/>
+          <w:i/>
+        </w:rPr>
+        <w:t xml:space="preserve">“</w:t>
+      </w:r>
+      <w:r>
+        <w:rPr>
+          <w:iCs/>
+          <w:i/>
+        </w:rPr>
+        <w:t xml:space="preserve">There are a total of thirty tidal creeks in Accomack County, which are largely supplied from groundwater discharge (approximately 80%).</w:t>
+      </w:r>
+      <w:r>
+        <w:rPr>
+          <w:iCs/>
+          <w:i/>
+        </w:rPr>
+        <w:t xml:space="preserve">”</w:t>
+      </w:r>
+      <w:r>
+        <w:t xml:space="preserve"> </w:t>
+      </w:r>
+      <w:r>
+        <w:t xml:space="preserve">Two things changed from the earlier draft: the figure is now attributed to its actual primary source rather than to sources that were never checked, and it is described as a share of the creeks’</w:t>
+      </w:r>
+      <w:r>
+        <w:t xml:space="preserve"> </w:t>
+      </w:r>
+      <w:r>
+        <w:rPr>
+          <w:bCs/>
+          <w:b/>
+        </w:rPr>
+        <w:t xml:space="preserve">supply/flow</w:t>
+      </w:r>
+      <w:r>
+        <w:t xml:space="preserve"> </w:t>
+      </w:r>
+      <w:r>
+        <w:t xml:space="preserve">rather than of</w:t>
+      </w:r>
+      <w:r>
+        <w:t xml:space="preserve"> </w:t>
+      </w:r>
+      <w:r>
+        <w:rPr>
+          <w:bCs/>
+          <w:b/>
+        </w:rPr>
+        <w:t xml:space="preserve">baseflow</w:t>
+      </w:r>
+      <w:r>
+        <w:t xml:space="preserve"> </w:t>
+      </w:r>
+      <w:r>
+        <w:t xml:space="preserve">(the earlier phrasing was near-tautological).</w:t>
+      </w:r>
+      <w:r>
+        <w:t xml:space="preserve"> </w:t>
+      </w:r>
+      <w:r>
+        <w:rPr>
+          <w:bCs/>
+          <w:b/>
+        </w:rPr>
+        <w:t xml:space="preserve">Scope note: this is an Accomack County figure. Do not present it as Shore-wide.</w:t>
+      </w:r>
+      <w:r>
+        <w:t xml:space="preserve"> </w:t>
+      </w:r>
+      <w:r>
+        <w:t xml:space="preserve">Northampton’s hydrogeologic setting is broadly similar, but no equivalent published figure has been located for it.</w:t>
       </w:r>
     </w:p>
     <w:p>
@@ -6312,7 +6372,7 @@
           <w:bCs/>
           <w:b/>
         </w:rPr>
-        <w:t xml:space="preserve">⚠ REMOVED in v3 — could not be verified:</w:t>
+        <w:t xml:space="preserve">✅ RESOLVED in v4 — source located:</w:t>
       </w:r>
     </w:p>
     <w:tbl>
@@ -6350,7 +6410,7 @@
               <w:jc w:val="left"/>
             </w:pPr>
             <w:r>
-              <w:t xml:space="preserve">Problem</w:t>
+              <w:t xml:space="preserve">Status</w:t>
             </w:r>
           </w:p>
         </w:tc>
@@ -6367,7 +6427,7 @@
               <w:t xml:space="preserve">“</w:t>
             </w:r>
             <w:r>
-              <w:t xml:space="preserve">~80% of baseflow in Accomack County’s ~30 tidal creeks arrives as groundwater discharge</w:t>
+              <w:t xml:space="preserve">~80% of the water supplying Accomack County’s 30 tidal creeks comes from groundwater discharge</w:t>
             </w:r>
             <w:r>
               <w:t xml:space="preserve">”</w:t>
@@ -6386,13 +6446,7 @@
                 <w:bCs/>
                 <w:b/>
               </w:rPr>
-              <w:t xml:space="preserve">Two issues.</w:t>
-            </w:r>
-            <w:r>
-              <w:t xml:space="preserve"> </w:t>
-            </w:r>
-            <w:r>
-              <w:t xml:space="preserve">(1)</w:t>
+              <w:t xml:space="preserve">Verified.</w:t>
             </w:r>
             <w:r>
               <w:t xml:space="preserve"> </w:t>
@@ -6402,46 +6456,49 @@
                 <w:iCs/>
                 <w:i/>
               </w:rPr>
-              <w:t xml:space="preserve">Sourcing:</w:t>
-            </w:r>
-            <w:r>
-              <w:t xml:space="preserve"> </w:t>
-            </w:r>
-            <w:r>
-              <w:t xml:space="preserve">traces to a web-search snippet from virginiaplaces.org, a secondary educational site — not peer-reviewed or agency-primary. It was cited in</w:t>
-            </w:r>
-            <w:r>
-              <w:t xml:space="preserve"> </w:t>
+              <w:t xml:space="preserve">Accomack County Regional Water Supply Plan</w:t>
+            </w:r>
+            <w:r>
+              <w:t xml:space="preserve">, April 2010:</w:t>
+            </w:r>
+            <w:r>
+              <w:t xml:space="preserve"> </w:t>
+            </w:r>
+            <w:r>
+              <w:rPr>
+                <w:iCs/>
+                <w:i/>
+              </w:rPr>
+              <w:t xml:space="preserve">“</w:t>
+            </w:r>
+            <w:r>
+              <w:rPr>
+                <w:iCs/>
+                <w:i/>
+              </w:rPr>
+              <w:t xml:space="preserve">There are a total of thirty tidal creeks in Accomack County, which are largely supplied from groundwater discharge (approximately 80%).</w:t>
+            </w:r>
+            <w:r>
+              <w:rPr>
+                <w:iCs/>
+                <w:i/>
+              </w:rPr>
+              <w:t xml:space="preserve">”</w:t>
+            </w:r>
+            <w:r>
+              <w:t xml:space="preserve"> </w:t>
+            </w:r>
+            <w:r>
+              <w:t xml:space="preserve">Available via A-NPDC (</w:t>
             </w:r>
             <w:r>
               <w:rPr>
                 <w:rStyle w:val="VerbatimChar"/>
               </w:rPr>
-              <w:t xml:space="preserve">research/pathway_2_tidal_creeks_marshes.md</w:t>
-            </w:r>
-            <w:r>
-              <w:t xml:space="preserve"> </w:t>
-            </w:r>
-            <w:r>
-              <w:t xml:space="preserve">as</w:t>
-            </w:r>
-            <w:r>
-              <w:t xml:space="preserve"> </w:t>
-            </w:r>
-            <w:r>
-              <w:t xml:space="preserve">“</w:t>
-            </w:r>
-            <w:r>
-              <w:t xml:space="preserve">(Richardson 1994; A-NPDC 2022),</w:t>
-            </w:r>
-            <w:r>
-              <w:t xml:space="preserve">”</w:t>
-            </w:r>
-            <w:r>
-              <w:t xml:space="preserve"> </w:t>
-            </w:r>
-            <w:r>
-              <w:t xml:space="preserve">but</w:t>
+              <w:t xml:space="preserve">a-npdc.org/groundwater/</w:t>
+            </w:r>
+            <w:r>
+              <w:t xml:space="preserve">) and esvaplan.org.</w:t>
             </w:r>
             <w:r>
               <w:t xml:space="preserve"> </w:t>
@@ -6451,47 +6508,13 @@
                 <w:bCs/>
                 <w:b/>
               </w:rPr>
-              <w:t xml:space="preserve">neither source was actually confirmed to contain the figure</w:t>
-            </w:r>
-            <w:r>
-              <w:t xml:space="preserve">; that citation was inferred, not verified. Attempts to check virginiaplaces.org, the A-NPDC groundwater factsheet, USGS WSP 2401, and a Sanford IAHS paper all returned HTTP 403. (2)</w:t>
-            </w:r>
-            <w:r>
-              <w:t xml:space="preserve"> </w:t>
-            </w:r>
-            <w:r>
-              <w:rPr>
-                <w:iCs/>
-                <w:i/>
-              </w:rPr>
-              <w:t xml:space="preserve">Phrasing:</w:t>
-            </w:r>
-            <w:r>
-              <w:t xml:space="preserve"> </w:t>
-            </w:r>
-            <w:r>
-              <w:t xml:space="preserve">“</w:t>
-            </w:r>
-            <w:r>
-              <w:t xml:space="preserve">80% of baseflow is groundwater-derived</w:t>
-            </w:r>
-            <w:r>
-              <w:t xml:space="preserve">”</w:t>
-            </w:r>
-            <w:r>
-              <w:t xml:space="preserve"> </w:t>
-            </w:r>
-            <w:r>
-              <w:t xml:space="preserve">is near-tautological — baseflow is by definition the groundwater component. The meaningful claim would be</w:t>
-            </w:r>
-            <w:r>
-              <w:t xml:space="preserve"> </w:t>
-            </w:r>
-            <w:r>
-              <w:t xml:space="preserve">“</w:t>
-            </w:r>
-            <w:r>
-              <w:t xml:space="preserve">groundwater supplies ~80% of</w:t>
+              <w:t xml:space="preserve">Scope: Accomack County only</w:t>
+            </w:r>
+            <w:r>
+              <w:t xml:space="preserve"> </w:t>
+            </w:r>
+            <w:r>
+              <w:t xml:space="preserve">— do not extend to Northampton or present as Shore-wide.</w:t>
             </w:r>
             <w:r>
               <w:t xml:space="preserve"> </w:t>
@@ -6501,13 +6524,41 @@
                 <w:bCs/>
                 <w:b/>
               </w:rPr>
-              <w:t xml:space="preserve">total streamflow</w:t>
-            </w:r>
-            <w:r>
-              <w:t xml:space="preserve">.</w:t>
-            </w:r>
-            <w:r>
+              <w:t xml:space="preserve">Phrasing: a share of creek supply/flow, not of</w:t>
+            </w:r>
+            <w:r>
+              <w:rPr>
+                <w:bCs/>
+                <w:b/>
+              </w:rPr>
+              <w:t xml:space="preserve"> </w:t>
+            </w:r>
+            <w:r>
+              <w:rPr>
+                <w:bCs/>
+                <w:b/>
+              </w:rPr>
+              <w:t xml:space="preserve">“</w:t>
+            </w:r>
+            <w:r>
+              <w:rPr>
+                <w:bCs/>
+                <w:b/>
+              </w:rPr>
+              <w:t xml:space="preserve">baseflow</w:t>
+            </w:r>
+            <w:r>
+              <w:rPr>
+                <w:bCs/>
+                <w:b/>
+              </w:rPr>
               <w:t xml:space="preserve">”</w:t>
+            </w:r>
+            <w:r>
+              <w:t xml:space="preserve"> </w:t>
+            </w:r>
+            <w:r>
+              <w:t xml:space="preserve">(baseflow is by definition the groundwater component, so the earlier wording was near-tautological).</w:t>
             </w:r>
           </w:p>
         </w:tc>
@@ -6519,29 +6570,65 @@
       </w:pPr>
       <w:r>
         <w:rPr>
-          <w:bCs/>
-          <w:b/>
-        </w:rPr>
-        <w:t xml:space="preserve">To restore it:</w:t>
-      </w:r>
-      <w:r>
-        <w:t xml:space="preserve"> </w:t>
-      </w:r>
-      <w:r>
-        <w:t xml:space="preserve">the likely primary sources are USGS WSP 2401 (Richardson 1994), USGS WSP 2479 (Speiran 1996), or a USGS base-flow separation study for Delmarva. A hydrologist at USGS Virginia–West Virginia Water Science Center or at A-NPDC could confirm quickly. If verified, phrase it as a fraction of</w:t>
-      </w:r>
-      <w:r>
-        <w:t xml:space="preserve"> </w:t>
-      </w:r>
-      <w:r>
-        <w:rPr>
           <w:iCs/>
           <w:i/>
         </w:rPr>
-        <w:t xml:space="preserve">total streamflow</w:t>
-      </w:r>
-      <w:r>
-        <w:t xml:space="preserve">, not of baseflow.</w:t>
+        <w:t xml:space="preserve">History of this figure, kept as a caution:</w:t>
+      </w:r>
+      <w:r>
+        <w:t xml:space="preserve"> </w:t>
+      </w:r>
+      <w:r>
+        <w:t xml:space="preserve">it first entered the project via a web-search snippet from virginiaplaces.org (a secondary educational site) and was cited in</w:t>
+      </w:r>
+      <w:r>
+        <w:t xml:space="preserve"> </w:t>
+      </w:r>
+      <w:r>
+        <w:rPr>
+          <w:rStyle w:val="VerbatimChar"/>
+        </w:rPr>
+        <w:t xml:space="preserve">research/pathway_2_tidal_creeks_marshes.md</w:t>
+      </w:r>
+      <w:r>
+        <w:t xml:space="preserve"> </w:t>
+      </w:r>
+      <w:r>
+        <w:t xml:space="preserve">as</w:t>
+      </w:r>
+      <w:r>
+        <w:t xml:space="preserve"> </w:t>
+      </w:r>
+      <w:r>
+        <w:t xml:space="preserve">“</w:t>
+      </w:r>
+      <w:r>
+        <w:t xml:space="preserve">(Richardson 1994; A-NPDC 2022)</w:t>
+      </w:r>
+      <w:r>
+        <w:t xml:space="preserve">”</w:t>
+      </w:r>
+      <w:r>
+        <w:t xml:space="preserve"> </w:t>
+      </w:r>
+      <w:r>
+        <w:t xml:space="preserve">—</w:t>
+      </w:r>
+      <w:r>
+        <w:t xml:space="preserve"> </w:t>
+      </w:r>
+      <w:r>
+        <w:rPr>
+          <w:bCs/>
+          <w:b/>
+        </w:rPr>
+        <w:t xml:space="preserve">sources that were never checked and do not appear to be its origin.</w:t>
+      </w:r>
+      <w:r>
+        <w:t xml:space="preserve"> </w:t>
+      </w:r>
+      <w:r>
+        <w:t xml:space="preserve">The number was real all along; the failure was citing plausible-sounding sources instead of tracking down the actual one. Alex Foxworthy located the primary source. Treat this as the standard for every other quantitative claim in the repository.</w:t>
       </w:r>
     </w:p>
     <w:p>
@@ -7572,6 +7659,99 @@
             </w:r>
             <w:r>
               <w:t xml:space="preserve">.</w:t>
+            </w:r>
+          </w:p>
+        </w:tc>
+      </w:tr>
+      <w:tr>
+        <w:tc>
+          <w:tcPr/>
+          <w:p>
+            <w:pPr>
+              <w:pStyle w:val="Compact"/>
+              <w:jc w:val="left"/>
+            </w:pPr>
+            <w:r>
+              <w:t xml:space="preserve">11</w:t>
+            </w:r>
+          </w:p>
+        </w:tc>
+        <w:tc>
+          <w:tcPr/>
+          <w:p>
+            <w:pPr>
+              <w:pStyle w:val="Compact"/>
+              <w:jc w:val="left"/>
+            </w:pPr>
+            <w:r>
+              <w:t xml:space="preserve">The ~80% groundwater figure was removed in v3 as unverifiable</w:t>
+            </w:r>
+          </w:p>
+        </w:tc>
+        <w:tc>
+          <w:tcPr/>
+          <w:p>
+            <w:pPr>
+              <w:pStyle w:val="Compact"/>
+              <w:jc w:val="left"/>
+            </w:pPr>
+            <w:r>
+              <w:rPr>
+                <w:bCs/>
+                <w:b/>
+              </w:rPr>
+              <w:t xml:space="preserve">Restored in v4</w:t>
+            </w:r>
+            <w:r>
+              <w:t xml:space="preserve"> </w:t>
+            </w:r>
+            <w:r>
+              <w:t xml:space="preserve">with its true source —</w:t>
+            </w:r>
+            <w:r>
+              <w:t xml:space="preserve"> </w:t>
+            </w:r>
+            <w:r>
+              <w:rPr>
+                <w:iCs/>
+                <w:i/>
+              </w:rPr>
+              <w:t xml:space="preserve">Accomack County Regional Water Supply Plan</w:t>
+            </w:r>
+            <w:r>
+              <w:t xml:space="preserve"> </w:t>
+            </w:r>
+            <w:r>
+              <w:t xml:space="preserve">(April 2010) — corrected phrasing (share of creek</w:t>
+            </w:r>
+            <w:r>
+              <w:t xml:space="preserve"> </w:t>
+            </w:r>
+            <w:r>
+              <w:rPr>
+                <w:bCs/>
+                <w:b/>
+              </w:rPr>
+              <w:t xml:space="preserve">supply</w:t>
+            </w:r>
+            <w:r>
+              <w:t xml:space="preserve">, not baseflow), and an explicit</w:t>
+            </w:r>
+            <w:r>
+              <w:t xml:space="preserve"> </w:t>
+            </w:r>
+            <w:r>
+              <w:rPr>
+                <w:bCs/>
+                <w:b/>
+              </w:rPr>
+              <w:t xml:space="preserve">Accomack-only</w:t>
+            </w:r>
+            <w:r>
+              <w:t xml:space="preserve"> </w:t>
+            </w:r>
+            <w:r>
+              <w:t xml:space="preserve">scope note.</w:t>
             </w:r>
           </w:p>
         </w:tc>

</xml_diff>